<commit_message>
JuanMaciasVasquez: Added The Moffat Bay Attractions to Word Document Pushing 4/2/26
</commit_message>
<xml_diff>
--- a/Module-2/CSD460_Capstone_Mod2_1_ZB_3.docx
+++ b/Module-2/CSD460_Capstone_Mod2_1_ZB_3.docx
@@ -665,6 +665,293 @@
                     <a:prstGeom prst="rect">
                       <a:avLst/>
                     </a:prstGeom>
+                  </pic:spPr>
+                </pic:pic>
+              </a:graphicData>
+            </a:graphic>
+          </wp:inline>
+        </w:drawing>
+      </w:r>
+    </w:p>
+    <w:p>
+      <w:r>
+        <w:t>Main Attractions Page</w:t>
+      </w:r>
+    </w:p>
+    <w:p>
+      <w:r>
+        <w:rPr>
+          <w:noProof/>
+        </w:rPr>
+        <w:drawing>
+          <wp:inline distT="0" distB="0" distL="0" distR="0" wp14:anchorId="0A0966FA" wp14:editId="5B134B7A">
+            <wp:extent cx="4584342" cy="3825189"/>
+            <wp:effectExtent l="0" t="0" r="6985" b="4445"/>
+            <wp:docPr id="369478014" name="Picture 1"/>
+            <wp:cNvGraphicFramePr>
+              <a:graphicFrameLocks xmlns:a="http://schemas.openxmlformats.org/drawingml/2006/main" noChangeAspect="1"/>
+            </wp:cNvGraphicFramePr>
+            <a:graphic xmlns:a="http://schemas.openxmlformats.org/drawingml/2006/main">
+              <a:graphicData uri="http://schemas.openxmlformats.org/drawingml/2006/picture">
+                <pic:pic xmlns:pic="http://schemas.openxmlformats.org/drawingml/2006/picture">
+                  <pic:nvPicPr>
+                    <pic:cNvPr id="0" name="Picture 1"/>
+                    <pic:cNvPicPr>
+                      <a:picLocks noChangeAspect="1" noChangeArrowheads="1"/>
+                    </pic:cNvPicPr>
+                  </pic:nvPicPr>
+                  <pic:blipFill>
+                    <a:blip r:embed="rId13">
+                      <a:extLst>
+                        <a:ext uri="{28A0092B-C50C-407E-A947-70E740481C1C}">
+                          <a14:useLocalDpi xmlns:a14="http://schemas.microsoft.com/office/drawing/2010/main" val="0"/>
+                        </a:ext>
+                      </a:extLst>
+                    </a:blip>
+                    <a:srcRect/>
+                    <a:stretch>
+                      <a:fillRect/>
+                    </a:stretch>
+                  </pic:blipFill>
+                  <pic:spPr bwMode="auto">
+                    <a:xfrm>
+                      <a:off x="0" y="0"/>
+                      <a:ext cx="4589283" cy="3829312"/>
+                    </a:xfrm>
+                    <a:prstGeom prst="rect">
+                      <a:avLst/>
+                    </a:prstGeom>
+                    <a:noFill/>
+                    <a:ln>
+                      <a:noFill/>
+                    </a:ln>
+                  </pic:spPr>
+                </pic:pic>
+              </a:graphicData>
+            </a:graphic>
+          </wp:inline>
+        </w:drawing>
+      </w:r>
+    </w:p>
+    <w:p>
+      <w:r>
+        <w:lastRenderedPageBreak/>
+        <w:t xml:space="preserve">Attractions Specific Pags </w:t>
+      </w:r>
+    </w:p>
+    <w:p>
+      <w:r>
+        <w:rPr>
+          <w:noProof/>
+        </w:rPr>
+        <w:drawing>
+          <wp:inline distT="0" distB="0" distL="0" distR="0" wp14:anchorId="4F5D73BE" wp14:editId="3D9E7D67">
+            <wp:extent cx="4689701" cy="3870960"/>
+            <wp:effectExtent l="0" t="0" r="0" b="0"/>
+            <wp:docPr id="1496093131" name="Picture 2"/>
+            <wp:cNvGraphicFramePr>
+              <a:graphicFrameLocks xmlns:a="http://schemas.openxmlformats.org/drawingml/2006/main" noChangeAspect="1"/>
+            </wp:cNvGraphicFramePr>
+            <a:graphic xmlns:a="http://schemas.openxmlformats.org/drawingml/2006/main">
+              <a:graphicData uri="http://schemas.openxmlformats.org/drawingml/2006/picture">
+                <pic:pic xmlns:pic="http://schemas.openxmlformats.org/drawingml/2006/picture">
+                  <pic:nvPicPr>
+                    <pic:cNvPr id="0" name="Picture 2"/>
+                    <pic:cNvPicPr>
+                      <a:picLocks noChangeAspect="1" noChangeArrowheads="1"/>
+                    </pic:cNvPicPr>
+                  </pic:nvPicPr>
+                  <pic:blipFill>
+                    <a:blip r:embed="rId14">
+                      <a:extLst>
+                        <a:ext uri="{28A0092B-C50C-407E-A947-70E740481C1C}">
+                          <a14:useLocalDpi xmlns:a14="http://schemas.microsoft.com/office/drawing/2010/main" val="0"/>
+                        </a:ext>
+                      </a:extLst>
+                    </a:blip>
+                    <a:srcRect/>
+                    <a:stretch>
+                      <a:fillRect/>
+                    </a:stretch>
+                  </pic:blipFill>
+                  <pic:spPr bwMode="auto">
+                    <a:xfrm>
+                      <a:off x="0" y="0"/>
+                      <a:ext cx="4704105" cy="3882849"/>
+                    </a:xfrm>
+                    <a:prstGeom prst="rect">
+                      <a:avLst/>
+                    </a:prstGeom>
+                    <a:noFill/>
+                    <a:ln>
+                      <a:noFill/>
+                    </a:ln>
+                  </pic:spPr>
+                </pic:pic>
+              </a:graphicData>
+            </a:graphic>
+          </wp:inline>
+        </w:drawing>
+      </w:r>
+    </w:p>
+    <w:p>
+      <w:r>
+        <w:rPr>
+          <w:noProof/>
+        </w:rPr>
+        <w:drawing>
+          <wp:inline distT="0" distB="0" distL="0" distR="0" wp14:anchorId="205BDDD3" wp14:editId="4E2D1FD3">
+            <wp:extent cx="4709160" cy="3887023"/>
+            <wp:effectExtent l="0" t="0" r="0" b="0"/>
+            <wp:docPr id="439551630" name="Picture 3"/>
+            <wp:cNvGraphicFramePr>
+              <a:graphicFrameLocks xmlns:a="http://schemas.openxmlformats.org/drawingml/2006/main" noChangeAspect="1"/>
+            </wp:cNvGraphicFramePr>
+            <a:graphic xmlns:a="http://schemas.openxmlformats.org/drawingml/2006/main">
+              <a:graphicData uri="http://schemas.openxmlformats.org/drawingml/2006/picture">
+                <pic:pic xmlns:pic="http://schemas.openxmlformats.org/drawingml/2006/picture">
+                  <pic:nvPicPr>
+                    <pic:cNvPr id="0" name="Picture 3"/>
+                    <pic:cNvPicPr>
+                      <a:picLocks noChangeAspect="1" noChangeArrowheads="1"/>
+                    </pic:cNvPicPr>
+                  </pic:nvPicPr>
+                  <pic:blipFill>
+                    <a:blip r:embed="rId15">
+                      <a:extLst>
+                        <a:ext uri="{28A0092B-C50C-407E-A947-70E740481C1C}">
+                          <a14:useLocalDpi xmlns:a14="http://schemas.microsoft.com/office/drawing/2010/main" val="0"/>
+                        </a:ext>
+                      </a:extLst>
+                    </a:blip>
+                    <a:srcRect/>
+                    <a:stretch>
+                      <a:fillRect/>
+                    </a:stretch>
+                  </pic:blipFill>
+                  <pic:spPr bwMode="auto">
+                    <a:xfrm>
+                      <a:off x="0" y="0"/>
+                      <a:ext cx="4709388" cy="3887211"/>
+                    </a:xfrm>
+                    <a:prstGeom prst="rect">
+                      <a:avLst/>
+                    </a:prstGeom>
+                    <a:noFill/>
+                    <a:ln>
+                      <a:noFill/>
+                    </a:ln>
+                  </pic:spPr>
+                </pic:pic>
+              </a:graphicData>
+            </a:graphic>
+          </wp:inline>
+        </w:drawing>
+      </w:r>
+    </w:p>
+    <w:p>
+      <w:r>
+        <w:rPr>
+          <w:noProof/>
+        </w:rPr>
+        <w:lastRenderedPageBreak/>
+        <w:drawing>
+          <wp:inline distT="0" distB="0" distL="0" distR="0" wp14:anchorId="7B9BEBCE" wp14:editId="28DBDE2D">
+            <wp:extent cx="4883566" cy="4030980"/>
+            <wp:effectExtent l="0" t="0" r="0" b="7620"/>
+            <wp:docPr id="1115822064" name="Picture 4"/>
+            <wp:cNvGraphicFramePr>
+              <a:graphicFrameLocks xmlns:a="http://schemas.openxmlformats.org/drawingml/2006/main" noChangeAspect="1"/>
+            </wp:cNvGraphicFramePr>
+            <a:graphic xmlns:a="http://schemas.openxmlformats.org/drawingml/2006/main">
+              <a:graphicData uri="http://schemas.openxmlformats.org/drawingml/2006/picture">
+                <pic:pic xmlns:pic="http://schemas.openxmlformats.org/drawingml/2006/picture">
+                  <pic:nvPicPr>
+                    <pic:cNvPr id="0" name="Picture 4"/>
+                    <pic:cNvPicPr>
+                      <a:picLocks noChangeAspect="1" noChangeArrowheads="1"/>
+                    </pic:cNvPicPr>
+                  </pic:nvPicPr>
+                  <pic:blipFill>
+                    <a:blip r:embed="rId16">
+                      <a:extLst>
+                        <a:ext uri="{28A0092B-C50C-407E-A947-70E740481C1C}">
+                          <a14:useLocalDpi xmlns:a14="http://schemas.microsoft.com/office/drawing/2010/main" val="0"/>
+                        </a:ext>
+                      </a:extLst>
+                    </a:blip>
+                    <a:srcRect/>
+                    <a:stretch>
+                      <a:fillRect/>
+                    </a:stretch>
+                  </pic:blipFill>
+                  <pic:spPr bwMode="auto">
+                    <a:xfrm>
+                      <a:off x="0" y="0"/>
+                      <a:ext cx="4890764" cy="4036921"/>
+                    </a:xfrm>
+                    <a:prstGeom prst="rect">
+                      <a:avLst/>
+                    </a:prstGeom>
+                    <a:noFill/>
+                    <a:ln>
+                      <a:noFill/>
+                    </a:ln>
+                  </pic:spPr>
+                </pic:pic>
+              </a:graphicData>
+            </a:graphic>
+          </wp:inline>
+        </w:drawing>
+      </w:r>
+    </w:p>
+    <w:p>
+      <w:r>
+        <w:rPr>
+          <w:noProof/>
+        </w:rPr>
+        <w:drawing>
+          <wp:inline distT="0" distB="0" distL="0" distR="0" wp14:anchorId="017AF44F" wp14:editId="55A41D08">
+            <wp:extent cx="4907280" cy="4050553"/>
+            <wp:effectExtent l="0" t="0" r="7620" b="7620"/>
+            <wp:docPr id="1510757989" name="Picture 5"/>
+            <wp:cNvGraphicFramePr>
+              <a:graphicFrameLocks xmlns:a="http://schemas.openxmlformats.org/drawingml/2006/main" noChangeAspect="1"/>
+            </wp:cNvGraphicFramePr>
+            <a:graphic xmlns:a="http://schemas.openxmlformats.org/drawingml/2006/main">
+              <a:graphicData uri="http://schemas.openxmlformats.org/drawingml/2006/picture">
+                <pic:pic xmlns:pic="http://schemas.openxmlformats.org/drawingml/2006/picture">
+                  <pic:nvPicPr>
+                    <pic:cNvPr id="0" name="Picture 5"/>
+                    <pic:cNvPicPr>
+                      <a:picLocks noChangeAspect="1" noChangeArrowheads="1"/>
+                    </pic:cNvPicPr>
+                  </pic:nvPicPr>
+                  <pic:blipFill>
+                    <a:blip r:embed="rId17">
+                      <a:extLst>
+                        <a:ext uri="{28A0092B-C50C-407E-A947-70E740481C1C}">
+                          <a14:useLocalDpi xmlns:a14="http://schemas.microsoft.com/office/drawing/2010/main" val="0"/>
+                        </a:ext>
+                      </a:extLst>
+                    </a:blip>
+                    <a:srcRect/>
+                    <a:stretch>
+                      <a:fillRect/>
+                    </a:stretch>
+                  </pic:blipFill>
+                  <pic:spPr bwMode="auto">
+                    <a:xfrm>
+                      <a:off x="0" y="0"/>
+                      <a:ext cx="4913537" cy="4055718"/>
+                    </a:xfrm>
+                    <a:prstGeom prst="rect">
+                      <a:avLst/>
+                    </a:prstGeom>
+                    <a:noFill/>
+                    <a:ln>
+                      <a:noFill/>
+                    </a:ln>
                   </pic:spPr>
                 </pic:pic>
               </a:graphicData>

</xml_diff>